<commit_message>
harassment: fix the 4 hallucination findings in manuscript
Applied via apply_hallucination_fixes.py which patches both
Manuscript_only.docx and Manuscript_all.docx in place.

1. H-H Cronbach alpha typo: .671 -> .571 (matches alfa/ canonical).
2. Surname spelling: Saltukuglu -> Saltukoglu in body
   (matches reference list and DOI 10.36315/2019inpact040).
3. Added 13 missing reference entries (Babiak, Bass, Cherniss,
   Christie, Cleckley, Fehr, Gandolfi, Hare 2003, Jones 2009/2010,
   Lynam, Paulhus 2001, Zuckerman) inserted alphabetically.
4. Removed unused Jones & Paulhus (2011) entry; the body cites
   2009 and 2010 only.

Body "Breevaart & de Vries, 2019" (no matching paper exists)
normalised to "2017" (Leadership Quarterly: HEXACO and abusive
supervision), which is in the reference list and matches the
citing context. Author should verify all 13 added entries before
submission.

Hallucination check now reports 165 pass, 0 fail
(python3 harassment/check_hallucinations.py).
</commit_message>
<xml_diff>
--- a/harassment/paper/Manuscript_all.docx
+++ b/harassment/paper/Manuscript_all.docx
@@ -1359,7 +1359,7 @@
         <w:rPr>
           <w:rFonts w:asciiTheme="majorBidi" w:eastAsiaTheme="minorEastAsia" w:hAnsiTheme="majorBidi" w:cstheme="majorBidi"/>
         </w:rPr>
-        <w:t xml:space="preserve"> &amp; de Vries, 2019; Pletzer et al., 2021). Honesty–Humility, reflecting characteristics such as </w:t>
+        <w:t xml:space="preserve"> &amp; de Vries, 2017; Pletzer et al., 2021). Honesty–Humility, reflecting characteristics such as </w:t>
       </w:r>
       <w:r>
         <w:rPr>
@@ -1506,7 +1506,7 @@
         <w:rPr>
           <w:rFonts w:asciiTheme="majorBidi" w:eastAsiaTheme="minorEastAsia" w:hAnsiTheme="majorBidi" w:cstheme="majorBidi"/>
         </w:rPr>
-        <w:t xml:space="preserve"> &amp; de Vries, 2019; Gandolfi et al., 2017</w:t>
+        <w:t xml:space="preserve"> &amp; de Vries, 2017; Gandolfi et al., 2017</w:t>
       </w:r>
       <w:r>
         <w:rPr>
@@ -1628,7 +1628,7 @@
         <w:rPr>
           <w:rFonts w:asciiTheme="majorBidi" w:eastAsiaTheme="minorEastAsia" w:hAnsiTheme="majorBidi" w:cstheme="majorBidi"/>
         </w:rPr>
-        <w:t>Saltuküğlu</w:t>
+        <w:t>Saltukoğlu</w:t>
       </w:r>
       <w:proofErr w:type="spellEnd"/>
       <w:r>
@@ -1649,7 +1649,7 @@
         <w:rPr>
           <w:rFonts w:asciiTheme="majorBidi" w:eastAsiaTheme="minorEastAsia" w:hAnsiTheme="majorBidi" w:cstheme="majorBidi"/>
         </w:rPr>
-        <w:t xml:space="preserve"> &amp; de Vries, 2019</w:t>
+        <w:t xml:space="preserve"> &amp; de Vries, 2017</w:t>
       </w:r>
       <w:r>
         <w:rPr>
@@ -2231,7 +2231,7 @@
         <w:rPr>
           <w:rFonts w:asciiTheme="majorBidi" w:hAnsiTheme="majorBidi" w:cstheme="majorBidi" w:hint="eastAsia"/>
         </w:rPr>
-        <w:t>6</w:t>
+        <w:t>5</w:t>
       </w:r>
       <w:r>
         <w:rPr>
@@ -5178,20 +5178,7 @@
         <w:ind w:left="720" w:hanging="720"/>
       </w:pPr>
       <w:r>
-        <w:t xml:space="preserve">Barnes, C. M., Lucianetti, L., Bhave, D. P., et al. (2015). “You wouldn’t like me when I’m sleepy”: Leaders’ sleep, daily abusive supervision, and work unit engagement. </w:t>
-      </w:r>
-      <w:r>
-        <w:rPr>
-          <w:i/>
-          <w:iCs/>
-        </w:rPr>
-        <w:t>Academy of Management Journal, 58</w:t>
-      </w:r>
-      <w:r>
-        <w:t>(5)</w:t>
-      </w:r>
-      <w:r>
-        <w:t>, 1419-1437. https://doi.org/10.5465/amj.2013.1063</w:t>
+        <w:t xml:space="preserve">Babiak, P., &amp; Hare, R. D. (2006). Snakes in suits: When psychopaths go to work. Regan Books / HarperCollins.</w:t>
       </w:r>
     </w:p>
     <w:p>
@@ -5199,13 +5186,34 @@
         <w:ind w:left="720" w:hanging="720"/>
       </w:pPr>
       <w:r>
-        <w:t xml:space="preserve">Barrick, M. R., &amp; Mount, M. K. (1991). The Big Five personality dimensions and job performance: A meta-analysis. </w:t>
+        <w:t xml:space="preserve">Barnes, C. M., Lucianetti, L., Bhave, D. P., et al. (2015). “You wouldn’t like me when I’m sleepy”: Leaders’ sleep, daily abusive supervision, and work unit engagement. </w:t>
       </w:r>
       <w:r>
         <w:rPr>
           <w:i/>
           <w:iCs/>
         </w:rPr>
+        <w:t>Academy of Management Journal, 58</w:t>
+      </w:r>
+      <w:r>
+        <w:t>(5)</w:t>
+      </w:r>
+      <w:r>
+        <w:t>, 1419-1437. https://doi.org/10.5465/amj.2013.1063</w:t>
+      </w:r>
+    </w:p>
+    <w:p>
+      <w:pPr>
+        <w:ind w:left="720" w:hanging="720"/>
+      </w:pPr>
+      <w:r>
+        <w:t xml:space="preserve">Barrick, M. R., &amp; Mount, M. K. (1991). The Big Five personality dimensions and job performance: A meta-analysis. </w:t>
+      </w:r>
+      <w:r>
+        <w:rPr>
+          <w:i/>
+          <w:iCs/>
+        </w:rPr>
         <w:t>Personnel Psychology, 44</w:t>
       </w:r>
       <w:r>
@@ -5213,6 +5221,14 @@
       </w:r>
       <w:r>
         <w:t>, 1-26. https://doi.org/10.1111/j.1744-6570.1991.tb00688.x</w:t>
+      </w:r>
+    </w:p>
+    <w:p>
+      <w:pPr>
+        <w:ind w:left="720" w:hanging="720"/>
+      </w:pPr>
+      <w:r>
+        <w:t xml:space="preserve">Bass, B. M. (1990). From transactional to transformational leadership: Learning to share the vision. Organizational Dynamics, 18(3), 19–31. https://doi.org/10.1016/0090-2616(90)90061-S</w:t>
       </w:r>
     </w:p>
     <w:p>
@@ -5506,6 +5522,14 @@
         <w:ind w:left="720" w:hanging="720"/>
       </w:pPr>
       <w:r>
+        <w:t xml:space="preserve">Cherniss, C., &amp; Goleman, D. (Eds.). (2001). The emotionally intelligent workplace: How to select for, measure, and improve emotional intelligence in individuals, groups, and organizations. Jossey-Bass.</w:t>
+      </w:r>
+    </w:p>
+    <w:p>
+      <w:pPr>
+        <w:ind w:left="720" w:hanging="720"/>
+      </w:pPr>
+      <w:r>
         <w:rPr>
           <w:rFonts w:hint="eastAsia"/>
         </w:rPr>
@@ -5554,6 +5578,22 @@
           <w:rFonts w:hint="eastAsia"/>
         </w:rPr>
         <w:t>, 83-117. https://doi.org/10.1111/j.1744-6570.2009.01163.x</w:t>
+      </w:r>
+    </w:p>
+    <w:p>
+      <w:pPr>
+        <w:ind w:left="720" w:hanging="720"/>
+      </w:pPr>
+      <w:r>
+        <w:t xml:space="preserve">Christie, R., &amp; Geis, F. L. (1970). Studies in Machiavellianism. Academic Press.</w:t>
+      </w:r>
+    </w:p>
+    <w:p>
+      <w:pPr>
+        <w:ind w:left="720" w:hanging="720"/>
+      </w:pPr>
+      <w:r>
+        <w:t xml:space="preserve">Cleckley, H. (1941). The mask of sanity: An attempt to clarify some issues about the so-called psychopathic personality. C. V. Mosby.</w:t>
       </w:r>
     </w:p>
     <w:p>
@@ -5734,38 +5774,7 @@
         <w:ind w:left="720" w:hanging="720"/>
       </w:pPr>
       <w:r>
-        <w:t xml:space="preserve">Fukui, Y., Oura, S., Matsuo, K., Inagaki (Fujii), T., &amp; Shima, Y. (2017). Development of the Japanese version of MET-CORE2 for objective measurement of empathy. </w:t>
-      </w:r>
-      <w:r>
-        <w:rPr>
-          <w:i/>
-          <w:iCs/>
-        </w:rPr>
-        <w:t>Japanese Journal of Research on Emotions, 25</w:t>
-      </w:r>
-      <w:r>
-        <w:t>(Supplement)</w:t>
-      </w:r>
-      <w:r>
-        <w:t>, ps01. https://doi.org/10.4092/jsre.25.Supplement_ps01</w:t>
-      </w:r>
-      <w:r>
-        <w:rPr>
-          <w:rFonts w:hint="eastAsia"/>
-        </w:rPr>
-        <w:t xml:space="preserve"> (in Japanese</w:t>
-      </w:r>
-      <w:r>
-        <w:rPr>
-          <w:rFonts w:hint="eastAsia"/>
-        </w:rPr>
-        <w:t>.</w:t>
-      </w:r>
-      <w:r>
-        <w:rPr>
-          <w:rFonts w:hint="eastAsia"/>
-        </w:rPr>
-        <w:t>)</w:t>
+        <w:t xml:space="preserve">Fehr, B., Samsom, D., &amp; Paulhus, D. L. (1992). The construct of Machiavellianism: Twenty years later. In C. D. Spielberger &amp; J. N. Butcher (Eds.), Advances in personality assessment (Vol. 9, pp. 77–116). Lawrence Erlbaum.</w:t>
       </w:r>
     </w:p>
     <w:p>
@@ -5773,26 +5782,38 @@
         <w:ind w:left="720" w:hanging="720"/>
       </w:pPr>
       <w:r>
-        <w:t xml:space="preserve">Fukui, Y., Matsuo, K., Oura, S., Inagaki, T., &amp; Shima, Y. (2018). Re-examination of the convergent validity of the Japanese version of MET-CORE2 for objective measurement of empathy. </w:t>
+        <w:t xml:space="preserve">Fukui, Y., Oura, S., Matsuo, K., Inagaki (Fujii), T., &amp; Shima, Y. (2017). Development of the Japanese version of MET-CORE2 for objective measurement of empathy. </w:t>
       </w:r>
       <w:r>
         <w:rPr>
           <w:i/>
           <w:iCs/>
         </w:rPr>
-        <w:t>Japanese Journal of Research on Emotions, 26</w:t>
+        <w:t>Japanese Journal of Research on Emotions, 25</w:t>
       </w:r>
       <w:r>
         <w:t>(Supplement)</w:t>
       </w:r>
       <w:r>
-        <w:t>, ps43. https://doi.org/10.4092/jsre.26.Supplement_ps43</w:t>
+        <w:t>, ps01. https://doi.org/10.4092/jsre.25.Supplement_ps01</w:t>
       </w:r>
       <w:r>
         <w:rPr>
           <w:rFonts w:hint="eastAsia"/>
         </w:rPr>
-        <w:t xml:space="preserve"> (in Japanese.)</w:t>
+        <w:t xml:space="preserve"> (in Japanese</w:t>
+      </w:r>
+      <w:r>
+        <w:rPr>
+          <w:rFonts w:hint="eastAsia"/>
+        </w:rPr>
+        <w:t>.</w:t>
+      </w:r>
+      <w:r>
+        <w:rPr>
+          <w:rFonts w:hint="eastAsia"/>
+        </w:rPr>
+        <w:t>)</w:t>
       </w:r>
     </w:p>
     <w:p>
@@ -5800,20 +5821,26 @@
         <w:ind w:left="720" w:hanging="720"/>
       </w:pPr>
       <w:r>
-        <w:t xml:space="preserve">Glenn, A. L., Raine, A., &amp; Schug, R. A. (2009). The neural correlates of moral decision-making in psychopathy. </w:t>
+        <w:t xml:space="preserve">Fukui, Y., Matsuo, K., Oura, S., Inagaki, T., &amp; Shima, Y. (2018). Re-examination of the convergent validity of the Japanese version of MET-CORE2 for objective measurement of empathy. </w:t>
       </w:r>
       <w:r>
         <w:rPr>
           <w:i/>
           <w:iCs/>
         </w:rPr>
-        <w:t>Molecular Psychiatry, 14</w:t>
-      </w:r>
-      <w:r>
-        <w:t>(1)</w:t>
-      </w:r>
-      <w:r>
-        <w:t>, 5–6. https://doi.org/10.1038/mp.2008.104</w:t>
+        <w:t>Japanese Journal of Research on Emotions, 26</w:t>
+      </w:r>
+      <w:r>
+        <w:t>(Supplement)</w:t>
+      </w:r>
+      <w:r>
+        <w:t>, ps43. https://doi.org/10.4092/jsre.26.Supplement_ps43</w:t>
+      </w:r>
+      <w:r>
+        <w:rPr>
+          <w:rFonts w:hint="eastAsia"/>
+        </w:rPr>
+        <w:t xml:space="preserve"> (in Japanese.)</w:t>
       </w:r>
     </w:p>
     <w:p>
@@ -5821,25 +5848,7 @@
         <w:ind w:left="720" w:hanging="720"/>
       </w:pPr>
       <w:r>
-        <w:t xml:space="preserve">Grijalva, E. and Newman, D.A. (2015), Narcissism–CWB Relationship. </w:t>
-      </w:r>
-      <w:r>
-        <w:rPr>
-          <w:i/>
-          <w:iCs/>
-        </w:rPr>
-        <w:t>Applied Psychology, 64</w:t>
-      </w:r>
-      <w:r>
-        <w:rPr>
-          <w:rFonts w:hint="eastAsia"/>
-          <w:i/>
-          <w:iCs/>
-        </w:rPr>
-        <w:t>,</w:t>
-      </w:r>
-      <w:r>
-        <w:t xml:space="preserve"> 93-126. https://doi.org/10.1111/apps.12025</w:t>
+        <w:t xml:space="preserve">Gandolfi, F., Stone, S., &amp; Deno, F. (2017). Servant leadership: An ancient style with 21st century relevance. Review of International Comparative Management, 18(4), 350–361.</w:t>
       </w:r>
     </w:p>
     <w:p>
@@ -5847,17 +5856,72 @@
         <w:ind w:left="720" w:hanging="720"/>
       </w:pPr>
       <w:r>
-        <w:t xml:space="preserve">Hare, R. D. (1982). Psychopathy and the personality dimensions of psychoticism, extraversion and neuroticism. </w:t>
+        <w:t xml:space="preserve">Glenn, A. L., Raine, A., &amp; Schug, R. A. (2009). The neural correlates of moral decision-making in psychopathy. </w:t>
       </w:r>
       <w:r>
         <w:rPr>
           <w:i/>
           <w:iCs/>
         </w:rPr>
+        <w:t>Molecular Psychiatry, 14</w:t>
+      </w:r>
+      <w:r>
+        <w:t>(1)</w:t>
+      </w:r>
+      <w:r>
+        <w:t>, 5–6. https://doi.org/10.1038/mp.2008.104</w:t>
+      </w:r>
+    </w:p>
+    <w:p>
+      <w:pPr>
+        <w:ind w:left="720" w:hanging="720"/>
+      </w:pPr>
+      <w:r>
+        <w:t xml:space="preserve">Grijalva, E. and Newman, D.A. (2015), Narcissism–CWB Relationship. </w:t>
+      </w:r>
+      <w:r>
+        <w:rPr>
+          <w:i/>
+          <w:iCs/>
+        </w:rPr>
+        <w:t>Applied Psychology, 64</w:t>
+      </w:r>
+      <w:r>
+        <w:rPr>
+          <w:rFonts w:hint="eastAsia"/>
+          <w:i/>
+          <w:iCs/>
+        </w:rPr>
+        <w:t>,</w:t>
+      </w:r>
+      <w:r>
+        <w:t xml:space="preserve"> 93-126. https://doi.org/10.1111/apps.12025</w:t>
+      </w:r>
+    </w:p>
+    <w:p>
+      <w:pPr>
+        <w:ind w:left="720" w:hanging="720"/>
+      </w:pPr>
+      <w:r>
+        <w:t xml:space="preserve">Hare, R. D. (1982). Psychopathy and the personality dimensions of psychoticism, extraversion and neuroticism. </w:t>
+      </w:r>
+      <w:r>
+        <w:rPr>
+          <w:i/>
+          <w:iCs/>
+        </w:rPr>
         <w:t>Personality and Individual Differences, 3</w:t>
       </w:r>
       <w:r>
         <w:t>, 35–42. https://doi.org/10.1016/0191-8869(82)90072-1</w:t>
+      </w:r>
+    </w:p>
+    <w:p>
+      <w:pPr>
+        <w:ind w:left="720" w:hanging="720"/>
+      </w:pPr>
+      <w:r>
+        <w:t xml:space="preserve">Hare, R. D. (2003). Manual for the Hare Psychopathy Checklist–Revised (2nd ed.). Multi-Health Systems.</w:t>
       </w:r>
     </w:p>
     <w:p>
@@ -6105,26 +6169,15 @@
         <w:ind w:left="720" w:hanging="720"/>
       </w:pPr>
       <w:r>
-        <w:t xml:space="preserve">Jones, D. N., &amp; Paulhus, D. L. (2011). Differentiating the Dark Triad within the interpersonal circumplex. In L. M. Horowitz &amp; S. Strack (Eds.), </w:t>
-      </w:r>
-      <w:r>
-        <w:rPr>
-          <w:i/>
-          <w:iCs/>
-        </w:rPr>
-        <w:t>Handbook of interpersonal psychology: Theory, research, assessment, and therapeutic interventions</w:t>
-      </w:r>
-      <w:r>
-        <w:t xml:space="preserve"> (pp. 249–267). John Wiley &amp; Sons, Inc..</w:t>
-      </w:r>
-      <w:r>
-        <w:rPr>
-          <w:rFonts w:hint="eastAsia"/>
-        </w:rPr>
-        <w:t xml:space="preserve"> </w:t>
-      </w:r>
-      <w:r>
-        <w:t>https://doi.org/10.1002/9781118001868.ch15</w:t>
+        <w:t xml:space="preserve">Jones, D. N., &amp; Paulhus, D. L. (2009). Machiavellianism. In M. R. Leary &amp; R. H. Hoyle (Eds.), Handbook of individual differences in social behavior (pp. 93–108). Guilford Press.</w:t>
+      </w:r>
+    </w:p>
+    <w:p>
+      <w:pPr>
+        <w:ind w:left="720" w:hanging="720"/>
+      </w:pPr>
+      <w:r>
+        <w:t xml:space="preserve">Jones, D. N., &amp; Paulhus, D. L. (2010). Different provocations trigger aggression in narcissists and psychopaths. Social Psychological and Personality Science, 1(1), 12–18. https://doi.org/10.1177/1948550609347591</w:t>
       </w:r>
     </w:p>
     <w:p>
@@ -6507,6 +6560,14 @@
         <w:ind w:left="720" w:hanging="720"/>
       </w:pPr>
       <w:r>
+        <w:t xml:space="preserve">Lynam, D. R., &amp; Derefinko, K. J. (2006). Psychopathy and personality. In C. J. Patrick (Ed.), Handbook of psychopathy (pp. 133–155). Guilford Press.</w:t>
+      </w:r>
+    </w:p>
+    <w:p>
+      <w:pPr>
+        <w:ind w:left="720" w:hanging="720"/>
+      </w:pPr>
+      <w:r>
         <w:t xml:space="preserve">Machiha, M. M., &amp; Brew, G. (2019). Predictors of Work Engagement Among University Teachers: The Role of Personality and Perceived </w:t>
       </w:r>
       <w:proofErr w:type="spellStart"/>
@@ -6972,6 +7033,14 @@
       </w:r>
       <w:r>
         <w:t>, 401–421. https://doi.org/10.1146/annurev.psych.57.102904.190127</w:t>
+      </w:r>
+    </w:p>
+    <w:p>
+      <w:pPr>
+        <w:ind w:left="720" w:hanging="720"/>
+      </w:pPr>
+      <w:r>
+        <w:t xml:space="preserve">Paulhus, D. L. (2001). Normal narcissism: Two minimalist accounts. Psychological Inquiry, 12(4), 228–230. https://doi.org/10.1207/S15327965PLI1204_5</w:t>
       </w:r>
     </w:p>
     <w:p>
@@ -16205,6 +16274,14 @@
             <w:vAlign w:val="bottom"/>
             <w:hideMark/>
           </w:tcPr>
+          <w:p>
+            <w:pPr>
+              <w:ind w:left="720" w:hanging="720"/>
+            </w:pPr>
+            <w:r>
+              <w:t xml:space="preserve">Zuckerman, M. (1994). Behavioral expressions and biosocial bases of sensation seeking. Cambridge University Press.</w:t>
+            </w:r>
+          </w:p>
           <w:p>
             <w:pPr>
               <w:jc w:val="center"/>

</xml_diff>

<commit_message>
harassment: relocate revised docx files from paper/ to paper-revisions/
paper/ is restored to the as-submitted (frozen) state and a new directory
paper-revisions/ holds the in-progress revision drafts. This separates the
historical submission record from the working revision.

Note: harassment/raw.csv, harassment/analysis.py, and harassment/res/ remain
in their updated (post-aggregation) state and are referenced by the
Declarations in paper-revisions/. The original-state versions are still
available via the previous commit.

https://claude.ai/code/session_01UeeDffUu7YPckkYAGec83X
</commit_message>
<xml_diff>
--- a/harassment/paper/Manuscript_all.docx
+++ b/harassment/paper/Manuscript_all.docx
@@ -1,6 +1,6 @@
 
 <file path=word/document.xml><?xml version="1.0" encoding="utf-8"?>
-<w:document xmlns:mc="http://schemas.openxmlformats.org/markup-compatibility/2006" xmlns:r="http://schemas.openxmlformats.org/officeDocument/2006/relationships" xmlns:w="http://schemas.openxmlformats.org/wordprocessingml/2006/main" xmlns:w14="http://schemas.microsoft.com/office/word/2010/wordml" mc:Ignorable="w14 w15 w16se w16cid w16 w16cex w16sdtdh w16sdtfl w16du wp14">
+<w:document xmlns:wpc="http://schemas.microsoft.com/office/word/2010/wordprocessingCanvas" xmlns:cx="http://schemas.microsoft.com/office/drawing/2014/chartex" xmlns:cx1="http://schemas.microsoft.com/office/drawing/2015/9/8/chartex" xmlns:cx2="http://schemas.microsoft.com/office/drawing/2015/10/21/chartex" xmlns:cx3="http://schemas.microsoft.com/office/drawing/2016/5/9/chartex" xmlns:cx4="http://schemas.microsoft.com/office/drawing/2016/5/10/chartex" xmlns:cx5="http://schemas.microsoft.com/office/drawing/2016/5/11/chartex" xmlns:cx6="http://schemas.microsoft.com/office/drawing/2016/5/12/chartex" xmlns:cx7="http://schemas.microsoft.com/office/drawing/2016/5/13/chartex" xmlns:cx8="http://schemas.microsoft.com/office/drawing/2016/5/14/chartex" xmlns:mc="http://schemas.openxmlformats.org/markup-compatibility/2006" xmlns:aink="http://schemas.microsoft.com/office/drawing/2016/ink" xmlns:am3d="http://schemas.microsoft.com/office/drawing/2017/model3d" xmlns:o="urn:schemas-microsoft-com:office:office" xmlns:oel="http://schemas.microsoft.com/office/2019/extlst" xmlns:r="http://schemas.openxmlformats.org/officeDocument/2006/relationships" xmlns:m="http://schemas.openxmlformats.org/officeDocument/2006/math" xmlns:v="urn:schemas-microsoft-com:vml" xmlns:wp14="http://schemas.microsoft.com/office/word/2010/wordprocessingDrawing" xmlns:wp="http://schemas.openxmlformats.org/drawingml/2006/wordprocessingDrawing" xmlns:w10="urn:schemas-microsoft-com:office:word" xmlns:w="http://schemas.openxmlformats.org/wordprocessingml/2006/main" xmlns:w14="http://schemas.microsoft.com/office/word/2010/wordml" xmlns:w15="http://schemas.microsoft.com/office/word/2012/wordml" xmlns:w16cex="http://schemas.microsoft.com/office/word/2018/wordml/cex" xmlns:w16cid="http://schemas.microsoft.com/office/word/2016/wordml/cid" xmlns:w16="http://schemas.microsoft.com/office/word/2018/wordml" xmlns:w16du="http://schemas.microsoft.com/office/word/2023/wordml/word16du" xmlns:w16sdtdh="http://schemas.microsoft.com/office/word/2020/wordml/sdtdatahash" xmlns:w16sdtfl="http://schemas.microsoft.com/office/word/2024/wordml/sdtformatlock" xmlns:w16se="http://schemas.microsoft.com/office/word/2015/wordml/symex" xmlns:wpg="http://schemas.microsoft.com/office/word/2010/wordprocessingGroup" xmlns:wpi="http://schemas.microsoft.com/office/word/2010/wordprocessingInk" xmlns:wne="http://schemas.microsoft.com/office/word/2006/wordml" xmlns:wps="http://schemas.microsoft.com/office/word/2010/wordprocessingShape" mc:Ignorable="w14 w15 w16se w16cid w16 w16cex w16sdtdh w16sdtfl w16du wp14">
   <w:background w:color="FFFFFF"/>
   <w:body>
     <w:p>
@@ -221,7 +221,7 @@
         <w:jc w:val="left"/>
       </w:pPr>
       <w:r>
-        <w:t xml:space="preserve">The author is the founder of SUNBLAZE Co., Ltd. (Tokyo, Japan), a private company that develops and markets proprietary personality-assessment and HR-analytics tools. The proprietary instruments offered by SUNBLAZE are independently developed and do not include the HEXACO-60 or the SD3-J used in the present study, and the findings reported here are not intended for, and will not be used in, SUNBLAZE product development, validation, marketing, or commercial promotion. SUNBLAZE provided no funding, personnel, infrastructure, data, or other resources for this research (see Funding). The author nonetheless discloses this commercial affiliation as a potential perceived conflict of interest in line with COPE and ICMJE guidance, so that readers and editors may evaluate the work in full knowledge of the author's commercial activity in the broader personality-assessment field. The author declares no other financial or non-financial interests relevant to this work.</w:t>
+        <w:t>The author declares that there are no financial or personal relationships with other people or organizations that could inappropriately influence (bias) this work. There are no conflicts of interest to declare.</w:t>
       </w:r>
     </w:p>
     <w:p>
@@ -257,7 +257,7 @@
         <w:jc w:val="left"/>
       </w:pPr>
       <w:r>
-        <w:t xml:space="preserve">This research was funded entirely from the personal resources of the author. No external grant from public, commercial, or not-for-profit funding bodies was received. In particular, SUNBLAZE Co., Ltd. provided no financial contribution and no in-kind support (no personnel time, no software, no servers, no office or equipment, and no commercial datasets) at any stage of the research. Participant compensation, crowdsourcing-platform fees, and any Article Processing Charge required for publication are paid from the author's personal funds.</w:t>
+        <w:t>This research did not receive any specific grant from funding agencies in the public, commercial, or not-for-profit sectors.</w:t>
       </w:r>
     </w:p>
     <w:p>
@@ -293,7 +293,7 @@
         <w:jc w:val="left"/>
       </w:pPr>
       <w:r>
-        <w:t xml:space="preserve">The study protocol was reviewed and approved by the Institutional Review Board of the Public Health Research Foundation (Reference No. 25G0001), an independent ethics review body unaffiliated with the author and SUNBLAZE Co., Ltd. All procedures complied with relevant Japanese regulations and the principles of the Declaration of Helsinki (2013).</w:t>
+        <w:t>The study was approved by the Institutional Review Board of the Public Health Research Foundation (Reference no. 25G0001). All procedures complied with relevant national and institutional ethical standards.</w:t>
       </w:r>
     </w:p>
     <w:p>
@@ -329,7 +329,7 @@
         <w:jc w:val="left"/>
       </w:pPr>
       <w:r>
-        <w:t xml:space="preserve">All participants were provided, prior to questionnaire administration, with written information regarding the purpose of the study, the voluntary nature of participation, their right to discontinue at any point without penalty, the planned handling of their responses (including separate storage and subsequent deletion of crowdsourcing-platform identifiers, retention of only de-identified questionnaire data, and public archiving of the de-identified dataset), and the planned dissemination of results. All participants provided informed consent before completing the questionnaires.</w:t>
+        <w:t>Informed consent was obtained from all participants after providing clear information on the study purpose, procedures, privacy protection, voluntary participation and the right to withdraw, and dissemination of results. Data were collected anonymously, de-identified, and stored securely.</w:t>
       </w:r>
     </w:p>
     <w:p>
@@ -366,7 +366,7 @@
         <w:jc w:val="left"/>
       </w:pPr>
       <w:r>
-        <w:t xml:space="preserve">The author thanks all participants for their voluntary cooperation in completing the questionnaires.</w:t>
+        <w:t>The author expresses sincere gratitude to all participants for their voluntary cooperation in completing the questionnaires. Appreciation is also extended to the Public Health Research Foundation’s IRB for their review and approval.</w:t>
       </w:r>
     </w:p>
     <w:p>
@@ -402,7 +402,7 @@
         <w:jc w:val="left"/>
       </w:pPr>
       <w:r>
-        <w:t xml:space="preserve">Participants were recruited through the Lancers crowdsourcing platform (https://www.lancers.jp). Lancers user identifiers were collected at intake solely to disburse participant compensation, were stored separately from questionnaire responses, and were permanently deleted after payment. The dataset retained for analysis and made publicly available is therefore a de-identified dataset; it contains no direct identifiers (names, email addresses, IP addresses, exact dates of birth, employer information, or job titles) and no indirect identifiers from the recruitment platform (Lancers user IDs). To further reduce re-identification risk in the public release, the geographic-area variable was generalized from the original 11 Japanese regions into three categories (Kanto, Kinki, Other), and only HEXACO-60 subscale scores, SD3-J subscale scores, power-harassment and gender-harassment scale scores, age in 10-year decade categories, binary gender, and the generalized geographic-area category are retained. Each (age decade, gender, area category) combination corresponds to a real-world reference population numbering at least in the hundreds of thousands of Japanese residents, so re-identification of any individual record would require auxiliary information that is not contained in the released file. The de-identified dataset is available at https://github.com/etoki/paper/blob/main/harassment/raw.csv and the analysis code at https://github.com/etoki/paper/tree/main/harassment.</w:t>
+        <w:t>The de-identified dataset that supports the findings of this study is publicly available on GitHub at: https://github.com/etoki/paper/blob/main/harassment/raw.csv. The file harassment/raw.csv contains all variables used in the analysis. No personally identifying information is included; data were anonymized prior to sharing. Additional materials (e.g., variable descriptions or analysis notes) can be provided upon reasonable request to the corresponding author.</w:t>
       </w:r>
     </w:p>
     <w:p>
@@ -438,7 +438,7 @@
         <w:jc w:val="left"/>
       </w:pPr>
       <w:r>
-        <w:t xml:space="preserve">A preprint of this manuscript is available on Research Square (https://doi.org/10.21203/rs.3.rs-7756124/v1) and is shared under the terms of the Research Square preprint posting policy.</w:t>
+        <w:t>A preprint version of this manuscript is available on Research Square: https://doi.org/10.21203/rs.3.rs-7756124/v1. This preprint has not been peer-reviewed and is shared under the author’s own copyright in accordance with the preprint policy of the Japanese Psychological Association.</w:t>
       </w:r>
     </w:p>
     <w:p>
@@ -475,7 +475,7 @@
       </w:pPr>
       <w:r>
         <w:lastRenderedPageBreak/>
-        <w:t xml:space="preserve">The author conceived and designed the study, recruited participants and collected the data, conducted all data analyses, drafted and revised the manuscript, and approved the final version submitted for publication.</w:t>
+        <w:t>The author conceived and designed the study, collected and analyzed the data, wrote the manuscript, and approves the final version.</w:t>
       </w:r>
     </w:p>
     <w:p>
@@ -1559,7 +1559,7 @@
         <w:rPr>
           <w:rFonts w:asciiTheme="majorBidi" w:hAnsiTheme="majorBidi" w:cstheme="majorBidi"/>
         </w:rPr>
-        <w:t>Participants were recruited through the Lancers crowdsourcing platform (https://www.lancers.jp), and 380 individuals responded to the survey. Participation was restricted to currently employed adults. At the beginning of the survey, respondents were required to confirm that they were presently employed in a workplace setting. Individuals who indicated that they were not employed were not allowed to proceed with the survey. Thus, the study exclusively targeted individuals with actual workplace experience.</w:t>
+        <w:t>Participants were recruited through a Japanese crowdsourcing platform, and 380 individuals responded to the survey. Participation was restricted to currently employed adults. At the beginning of the survey, respondents were required to confirm that they were presently employed in a workplace setting. Individuals who indicated that they were not employed were not allowed to proceed with the survey. Thus, the study exclusively targeted individuals with actual workplace experience.</w:t>
       </w:r>
       <w:r>
         <w:rPr>
@@ -1617,7 +1617,25 @@
         <w:rPr>
           <w:rFonts w:asciiTheme="majorBidi" w:hAnsiTheme="majorBidi" w:cstheme="majorBidi"/>
         </w:rPr>
-        <w:t xml:space="preserve">Prior to questionnaire administration, participants were provided with written information about the purpose of the study, the procedures, the voluntary nature of participation and their right to withdraw at any time without penalty, the privacy-protection procedures (including the separate storage and subsequent permanent deletion of crowdsourcing-platform user identifiers, the retention of only de-identified questionnaire data, and the public archiving of the de-identified dataset), and the planned dissemination of results. All participants provided informed consent before responding to the questionnaire. Crowdsourcing-platform user identifiers were temporarily linked to questionnaire responses solely for the purpose of disbursing participant compensation and were permanently deleted after payment, after which the dataset retained for analysis and public release contained no direct or indirect identifiers (the dataset was de-identified, not anonymously collected). The study protocol was reviewed and approved by the Institutional Review Board of the Public Health Research Foundation (Reference No. 25G0001), an independent ethics review body unaffiliated with the author and SUNBLAZE Co., Ltd.</w:t>
+        <w:t xml:space="preserve">Participants were provided with explanations regarding the purpose of the study, procedures, privacy protection, voluntary participation and the right to withdraw, and dissemination of results. Informed consent was obtained from all participants. Collected data were anonymized and stored securely. The study was approved by the Institutional Review Board of </w:t>
+      </w:r>
+      <w:r>
+        <w:rPr>
+          <w:rFonts w:asciiTheme="majorBidi" w:hAnsiTheme="majorBidi" w:cstheme="majorBidi"/>
+        </w:rPr>
+        <w:t>the Public Health Research Foundation</w:t>
+      </w:r>
+      <w:r>
+        <w:rPr>
+          <w:rFonts w:asciiTheme="majorBidi" w:hAnsiTheme="majorBidi" w:cstheme="majorBidi"/>
+        </w:rPr>
+        <w:t xml:space="preserve"> </w:t>
+      </w:r>
+      <w:r>
+        <w:rPr>
+          <w:rFonts w:asciiTheme="majorBidi" w:hAnsiTheme="majorBidi" w:cstheme="majorBidi"/>
+        </w:rPr>
+        <w:t>(Reference no.25G0001).</w:t>
       </w:r>
     </w:p>
     <w:p>

</xml_diff>